<commit_message>
doc: atulizacao do cronograma
</commit_message>
<xml_diff>
--- a/ApêndiceA-Planejamento/PID_Cronograma_Projeto.docx
+++ b/ApêndiceA-Planejamento/PID_Cronograma_Projeto.docx
@@ -3248,6 +3248,14 @@
               </w:rPr>
               <w:t> </w:t>
             </w:r>
+            <w:r>
+              <w:rPr>
+                <w:rFonts w:ascii="Arial" w:hAnsi="Arial" w:cs="Arial"/>
+                <w:sz w:val="20"/>
+                <w:szCs w:val="20"/>
+              </w:rPr>
+              <w:t>R</w:t>
+            </w:r>
           </w:p>
         </w:tc>
         <w:tc>
@@ -3692,6 +3700,14 @@
                 <w:szCs w:val="20"/>
               </w:rPr>
             </w:pPr>
+            <w:r>
+              <w:rPr>
+                <w:rFonts w:ascii="Arial" w:hAnsi="Arial" w:eastAsia="Arial" w:cs="Arial"/>
+                <w:sz w:val="20"/>
+                <w:szCs w:val="20"/>
+              </w:rPr>
+              <w:t>Modelagem de dados</w:t>
+            </w:r>
           </w:p>
         </w:tc>
         <w:tc>
@@ -3715,101 +3731,133 @@
                 <w:szCs w:val="20"/>
               </w:rPr>
             </w:pPr>
-          </w:p>
-        </w:tc>
-        <w:tc>
-          <w:tcPr>
-            <w:tcW w:w="630" w:type="dxa"/>
-            <w:tcBorders>
-              <w:top w:val="single" w:color="000000" w:themeColor="text1" w:sz="4" w:space="0"/>
-              <w:left w:val="nil"/>
-              <w:bottom w:val="single" w:color="000000" w:themeColor="text1" w:sz="4" w:space="0"/>
-              <w:right w:val="single" w:color="000000" w:themeColor="text1" w:sz="4" w:space="0"/>
-            </w:tcBorders>
-            <w:shd w:val="clear" w:color="auto" w:fill="FFFFFF" w:themeFill="background1"/>
-            <w:tcMar/>
-            <w:vAlign w:val="bottom"/>
-          </w:tcPr>
-          <w:p>
-            <w:pPr>
-              <w:spacing w:after="0" w:line="240" w:lineRule="auto"/>
-              <w:rPr>
-                <w:rFonts w:ascii="Arial" w:hAnsi="Arial" w:cs="Arial"/>
-                <w:sz w:val="20"/>
-                <w:szCs w:val="20"/>
-              </w:rPr>
-            </w:pPr>
-            <w:r>
-              <w:rPr>
-                <w:rFonts w:ascii="Arial" w:hAnsi="Arial" w:cs="Arial"/>
-                <w:sz w:val="20"/>
-                <w:szCs w:val="20"/>
-              </w:rPr>
-              <w:t> </w:t>
-            </w:r>
-          </w:p>
-        </w:tc>
-        <w:tc>
-          <w:tcPr>
-            <w:tcW w:w="630" w:type="dxa"/>
-            <w:tcBorders>
-              <w:top w:val="single" w:color="000000" w:themeColor="text1" w:sz="4" w:space="0"/>
-              <w:left w:val="nil"/>
-              <w:bottom w:val="single" w:color="000000" w:themeColor="text1" w:sz="4" w:space="0"/>
-              <w:right w:val="single" w:color="000000" w:themeColor="text1" w:sz="4" w:space="0"/>
-            </w:tcBorders>
-            <w:shd w:val="clear" w:color="auto" w:fill="FFFFFF" w:themeFill="background1"/>
-            <w:tcMar/>
-            <w:vAlign w:val="bottom"/>
-          </w:tcPr>
-          <w:p>
-            <w:pPr>
-              <w:spacing w:after="0" w:line="240" w:lineRule="auto"/>
-              <w:rPr>
-                <w:rFonts w:ascii="Arial" w:hAnsi="Arial" w:cs="Arial"/>
-                <w:sz w:val="20"/>
-                <w:szCs w:val="20"/>
-              </w:rPr>
-            </w:pPr>
-            <w:r>
-              <w:rPr>
-                <w:rFonts w:ascii="Arial" w:hAnsi="Arial" w:cs="Arial"/>
-                <w:sz w:val="20"/>
-                <w:szCs w:val="20"/>
-              </w:rPr>
-              <w:t> </w:t>
-            </w:r>
-          </w:p>
-        </w:tc>
-        <w:tc>
-          <w:tcPr>
-            <w:tcW w:w="630" w:type="dxa"/>
-            <w:tcBorders>
-              <w:top w:val="single" w:color="000000" w:themeColor="text1" w:sz="4" w:space="0"/>
-              <w:left w:val="nil"/>
-              <w:bottom w:val="single" w:color="000000" w:themeColor="text1" w:sz="4" w:space="0"/>
-              <w:right w:val="single" w:color="000000" w:themeColor="text1" w:sz="4" w:space="0"/>
-            </w:tcBorders>
-            <w:shd w:val="clear" w:color="auto" w:fill="FFFFFF" w:themeFill="background1"/>
-            <w:tcMar/>
-            <w:vAlign w:val="bottom"/>
-          </w:tcPr>
-          <w:p>
-            <w:pPr>
-              <w:spacing w:after="0" w:line="240" w:lineRule="auto"/>
-              <w:rPr>
-                <w:rFonts w:ascii="Arial" w:hAnsi="Arial" w:cs="Arial"/>
-                <w:sz w:val="20"/>
-                <w:szCs w:val="20"/>
-              </w:rPr>
-            </w:pPr>
-            <w:r>
-              <w:rPr>
-                <w:rFonts w:ascii="Arial" w:hAnsi="Arial" w:cs="Arial"/>
-                <w:sz w:val="20"/>
-                <w:szCs w:val="20"/>
-              </w:rPr>
-              <w:t> </w:t>
+            <w:r>
+              <w:rPr>
+                <w:rFonts w:ascii="Arial" w:hAnsi="Arial" w:eastAsia="Arial" w:cs="Arial"/>
+                <w:sz w:val="20"/>
+                <w:szCs w:val="20"/>
+              </w:rPr>
+              <w:t xml:space="preserve">Modelagem </w:t>
+            </w:r>
+            <w:r>
+              <w:rPr>
+                <w:rFonts w:ascii="Arial" w:hAnsi="Arial" w:eastAsia="Arial" w:cs="Arial"/>
+                <w:sz w:val="20"/>
+                <w:szCs w:val="20"/>
+              </w:rPr>
+              <w:t>básica</w:t>
+            </w:r>
+            <w:r>
+              <w:rPr>
+                <w:rFonts w:ascii="Arial" w:hAnsi="Arial" w:eastAsia="Arial" w:cs="Arial"/>
+                <w:sz w:val="20"/>
+                <w:szCs w:val="20"/>
+              </w:rPr>
+              <w:t xml:space="preserve"> do banco de dados</w:t>
+            </w:r>
+          </w:p>
+        </w:tc>
+        <w:tc>
+          <w:tcPr>
+            <w:tcW w:w="630" w:type="dxa"/>
+            <w:tcBorders>
+              <w:top w:val="single" w:color="000000" w:themeColor="text1" w:sz="4" w:space="0"/>
+              <w:left w:val="nil"/>
+              <w:bottom w:val="single" w:color="000000" w:themeColor="text1" w:sz="4" w:space="0"/>
+              <w:right w:val="single" w:color="000000" w:themeColor="text1" w:sz="4" w:space="0"/>
+            </w:tcBorders>
+            <w:shd w:val="clear" w:color="auto" w:fill="FFFFFF" w:themeFill="background1"/>
+            <w:tcMar/>
+            <w:vAlign w:val="bottom"/>
+          </w:tcPr>
+          <w:p>
+            <w:pPr>
+              <w:spacing w:after="0" w:line="240" w:lineRule="auto"/>
+              <w:rPr>
+                <w:rFonts w:ascii="Arial" w:hAnsi="Arial" w:cs="Arial"/>
+                <w:sz w:val="20"/>
+                <w:szCs w:val="20"/>
+              </w:rPr>
+            </w:pPr>
+            <w:r>
+              <w:rPr>
+                <w:rFonts w:ascii="Arial" w:hAnsi="Arial" w:cs="Arial"/>
+                <w:sz w:val="20"/>
+                <w:szCs w:val="20"/>
+              </w:rPr>
+              <w:t> </w:t>
+            </w:r>
+          </w:p>
+        </w:tc>
+        <w:tc>
+          <w:tcPr>
+            <w:tcW w:w="630" w:type="dxa"/>
+            <w:tcBorders>
+              <w:top w:val="single" w:color="000000" w:themeColor="text1" w:sz="4" w:space="0"/>
+              <w:left w:val="nil"/>
+              <w:bottom w:val="single" w:color="000000" w:themeColor="text1" w:sz="4" w:space="0"/>
+              <w:right w:val="single" w:color="000000" w:themeColor="text1" w:sz="4" w:space="0"/>
+            </w:tcBorders>
+            <w:shd w:val="clear" w:color="auto" w:fill="FFFFFF" w:themeFill="background1"/>
+            <w:tcMar/>
+            <w:vAlign w:val="bottom"/>
+          </w:tcPr>
+          <w:p>
+            <w:pPr>
+              <w:spacing w:after="0" w:line="240" w:lineRule="auto"/>
+              <w:rPr>
+                <w:rFonts w:ascii="Arial" w:hAnsi="Arial" w:cs="Arial"/>
+                <w:sz w:val="20"/>
+                <w:szCs w:val="20"/>
+              </w:rPr>
+            </w:pPr>
+            <w:r>
+              <w:rPr>
+                <w:rFonts w:ascii="Arial" w:hAnsi="Arial" w:cs="Arial"/>
+                <w:sz w:val="20"/>
+                <w:szCs w:val="20"/>
+              </w:rPr>
+              <w:t> </w:t>
+            </w:r>
+          </w:p>
+        </w:tc>
+        <w:tc>
+          <w:tcPr>
+            <w:tcW w:w="630" w:type="dxa"/>
+            <w:tcBorders>
+              <w:top w:val="single" w:color="000000" w:themeColor="text1" w:sz="4" w:space="0"/>
+              <w:left w:val="nil"/>
+              <w:bottom w:val="single" w:color="000000" w:themeColor="text1" w:sz="4" w:space="0"/>
+              <w:right w:val="single" w:color="000000" w:themeColor="text1" w:sz="4" w:space="0"/>
+            </w:tcBorders>
+            <w:shd w:val="clear" w:color="auto" w:fill="FFFFFF" w:themeFill="background1"/>
+            <w:tcMar/>
+            <w:vAlign w:val="bottom"/>
+          </w:tcPr>
+          <w:p>
+            <w:pPr>
+              <w:spacing w:after="0" w:line="240" w:lineRule="auto"/>
+              <w:rPr>
+                <w:rFonts w:ascii="Arial" w:hAnsi="Arial" w:cs="Arial"/>
+                <w:sz w:val="20"/>
+                <w:szCs w:val="20"/>
+              </w:rPr>
+            </w:pPr>
+            <w:r>
+              <w:rPr>
+                <w:rFonts w:ascii="Arial" w:hAnsi="Arial" w:cs="Arial"/>
+                <w:sz w:val="20"/>
+                <w:szCs w:val="20"/>
+              </w:rPr>
+              <w:t> </w:t>
+            </w:r>
+            <w:r>
+              <w:rPr>
+                <w:rFonts w:ascii="Arial" w:hAnsi="Arial" w:cs="Arial"/>
+                <w:sz w:val="20"/>
+                <w:szCs w:val="20"/>
+              </w:rPr>
+              <w:t>P</w:t>
             </w:r>
           </w:p>
         </w:tc>
@@ -4379,6 +4427,14 @@
                 <w:szCs w:val="20"/>
               </w:rPr>
               <w:t> </w:t>
+            </w:r>
+            <w:r>
+              <w:rPr>
+                <w:rFonts w:ascii="Arial" w:hAnsi="Arial" w:cs="Arial"/>
+                <w:sz w:val="20"/>
+                <w:szCs w:val="20"/>
+              </w:rPr>
+              <w:t>R</w:t>
             </w:r>
           </w:p>
         </w:tc>

</xml_diff>